<commit_message>
Update education course dates to match latest CV.
Sync Tsofen-Tashbik, ZioNet bootcamp, and Ruppin periods, and replace the downloadable CV.

Co-authored-by: Cursor <cursoragent@cursor.com>
</commit_message>
<xml_diff>
--- a/Ayoub-Nasrallah-CV.docx
+++ b/Ayoub-Nasrallah-CV.docx
@@ -694,7 +694,7 @@
                 <w:color w:val="585858"/>
                 <w:sz w:val="18"/>
               </w:rPr>
-              <w:t>Feb 2024 - May 2024</w:t>
+              <w:t>Nov 2023 - Apr 2024</w:t>
             </w:r>
           </w:p>
         </w:tc>
@@ -823,7 +823,7 @@
                 <w:color w:val="585858"/>
                 <w:sz w:val="18"/>
               </w:rPr>
-              <w:t>Nov 2021 - Mar 2022</w:t>
+              <w:t>Nov 2021 - May 2022</w:t>
             </w:r>
           </w:p>
         </w:tc>
@@ -947,7 +947,7 @@
                 <w:color w:val="585858"/>
                 <w:sz w:val="18"/>
               </w:rPr>
-              <w:t>Oct 2019 - Jul 2021</w:t>
+              <w:t>Oct 2019 - May 2021</w:t>
             </w:r>
           </w:p>
         </w:tc>

</xml_diff>